<commit_message>
docs: add university logo and author name to all title pages
Official Université Paris 1 Panthéon-Sorbonne logo (2024, public
domain, sourced from Wikimedia Commons) added to the top of each
document's title page, with the author's name (MATANE SOUNGOUENE
Saïd Mansour) displayed above the DU Data Analytics / university /
year block. Applies to docs/rapport.docx, presentation_projet.docx,
and guide_schemas.docx.
</commit_message>
<xml_diff>
--- a/docs/guide_schemas.docx
+++ b/docs/guide_schemas.docx
@@ -2,7 +2,45 @@
 <file path=word/document.xml><?xml version="1.0" encoding="utf-8"?>
 <w:document xmlns:wpc="http://schemas.microsoft.com/office/word/2010/wordprocessingCanvas" xmlns:mo="http://schemas.microsoft.com/office/mac/office/2008/main" xmlns:mc="http://schemas.openxmlformats.org/markup-compatibility/2006" xmlns:mv="urn:schemas-microsoft-com:mac:vml" xmlns:o="urn:schemas-microsoft-com:office:office" xmlns:r="http://schemas.openxmlformats.org/officeDocument/2006/relationships" xmlns:m="http://schemas.openxmlformats.org/officeDocument/2006/math" xmlns:v="urn:schemas-microsoft-com:vml" xmlns:wp14="http://schemas.microsoft.com/office/word/2010/wordprocessingDrawing" xmlns:wp="http://schemas.openxmlformats.org/drawingml/2006/wordprocessingDrawing" xmlns:w10="urn:schemas-microsoft-com:office:word" xmlns:w="http://schemas.openxmlformats.org/wordprocessingml/2006/main" xmlns:w14="http://schemas.microsoft.com/office/word/2010/wordml" xmlns:wpg="http://schemas.microsoft.com/office/word/2010/wordprocessingGroup" xmlns:wpi="http://schemas.microsoft.com/office/word/2010/wordprocessingInk" xmlns:wne="http://schemas.microsoft.com/office/word/2006/wordml" xmlns:wps="http://schemas.microsoft.com/office/word/2010/wordprocessingShape" mc:Ignorable="w14 wp14">
   <w:body>
-    <w:p/>
+    <w:p>
+      <w:pPr>
+        <w:jc w:val="center"/>
+      </w:pPr>
+      <w:r>
+        <w:drawing>
+          <wp:inline xmlns:a="http://schemas.openxmlformats.org/drawingml/2006/main" xmlns:pic="http://schemas.openxmlformats.org/drawingml/2006/picture">
+            <wp:extent cx="2160000" cy="983250"/>
+            <wp:docPr id="8" name="Picture 8"/>
+            <wp:cNvGraphicFramePr>
+              <a:graphicFrameLocks noChangeAspect="1"/>
+            </wp:cNvGraphicFramePr>
+            <a:graphic>
+              <a:graphicData uri="http://schemas.openxmlformats.org/drawingml/2006/picture">
+                <pic:pic>
+                  <pic:nvPicPr>
+                    <pic:cNvPr id="0" name="univ_logo.png"/>
+                    <pic:cNvPicPr/>
+                  </pic:nvPicPr>
+                  <pic:blipFill>
+                    <a:blip r:embed="rId17"/>
+                    <a:stretch>
+                      <a:fillRect/>
+                    </a:stretch>
+                  </pic:blipFill>
+                  <pic:spPr>
+                    <a:xfrm>
+                      <a:off x="0" y="0"/>
+                      <a:ext cx="2160000" cy="983250"/>
+                    </a:xfrm>
+                    <a:prstGeom prst="rect"/>
+                  </pic:spPr>
+                </pic:pic>
+              </a:graphicData>
+            </a:graphic>
+          </wp:inline>
+        </w:drawing>
+      </w:r>
+    </w:p>
     <w:p/>
     <w:p/>
     <w:p/>
@@ -39,6 +77,20 @@
     <w:p/>
     <w:p/>
     <w:p/>
+    <w:p/>
+    <w:p>
+      <w:pPr>
+        <w:jc w:val="center"/>
+      </w:pPr>
+      <w:r>
+        <w:rPr>
+          <w:b/>
+          <w:color w:val="1F3A5F"/>
+          <w:sz w:val="28"/>
+        </w:rPr>
+        <w:t>MATANE SOUNGOUENE Saïd Mansour</w:t>
+      </w:r>
+    </w:p>
     <w:p/>
     <w:p>
       <w:pPr>

</xml_diff>